<commit_message>
Deploy preview for PR 14 🛫
</commit_message>
<xml_diff>
--- a/pr-preview/pr-14/chapters/chapter1-tracked-changes.docx
+++ b/pr-preview/pr-14/chapters/chapter1-tracked-changes.docx
@@ -10,13 +10,21 @@
         <w:t xml:space="preserve">Chapter 1: Introduction</w:t>
       </w:r>
     </w:p>
-    <w:bookmarkStart w:id="16" w:name="chapter-1-introduction"/>
+    <w:p>
+      <w:pPr>
+        <w:pStyle w:val="FirstParagraph"/>
+      </w:pPr>
+      <w:r>
+        <w:t xml:space="preserve">This is the first chapter of your website. Replace this content with your own.</w:t>
+      </w:r>
+    </w:p>
+    <w:bookmarkStart w:id="11" w:name="section-1.1"/>
     <w:p>
       <w:pPr>
         <w:pStyle w:val="Heading1"/>
       </w:pPr>
       <w:r>
-        <w:t xml:space="preserve">1. Chapter 1: Introduction</w:t>
+        <w:t xml:space="preserve">1. Section 1.1</w:t>
       </w:r>
     </w:p>
     <w:p>
@@ -24,33 +32,16 @@
         <w:pStyle w:val="FirstParagraph"/>
       </w:pPr>
       <w:r>
-        <w:t xml:space="preserve">This is the first chapter of your website. Replace this content with your own.</w:t>
-      </w:r>
-    </w:p>
-    <w:bookmarkStart w:id="11" w:name="section-1.1"/>
+        <w:t xml:space="preserve">Add your content here.</w:t>
+      </w:r>
+    </w:p>
+    <w:bookmarkStart w:id="10" w:name="subsection-1.1.1"/>
     <w:p>
       <w:pPr>
         <w:pStyle w:val="Heading2"/>
       </w:pPr>
       <w:r>
-        <w:t xml:space="preserve">1.1 Section 1.1</w:t>
-      </w:r>
-    </w:p>
-    <w:p>
-      <w:pPr>
-        <w:pStyle w:val="FirstParagraph"/>
-      </w:pPr>
-      <w:r>
-        <w:t xml:space="preserve">Add your content here.</w:t>
-      </w:r>
-    </w:p>
-    <w:bookmarkStart w:id="10" w:name="subsection-1.1.1"/>
-    <w:p>
-      <w:pPr>
-        <w:pStyle w:val="Heading3"/>
-      </w:pPr>
-      <w:r>
-        <w:t xml:space="preserve">1.1.1 Subsection 1.1.1</w:t>
+        <w:t xml:space="preserve">1.1 Subsection 1.1.1</w:t>
       </w:r>
     </w:p>
     <w:p>
@@ -164,10 +155,10 @@
     <w:bookmarkStart w:id="12" w:name="section-1.2"/>
     <w:p>
       <w:pPr>
-        <w:pStyle w:val="Heading2"/>
-      </w:pPr>
-      <w:r>
-        <w:t xml:space="preserve">1.2 Section 1.2</w:t>
+        <w:pStyle w:val="Heading1"/>
+      </w:pPr>
+      <w:r>
+        <w:t xml:space="preserve">2. Section 1.2</w:t>
       </w:r>
     </w:p>
     <w:p>
@@ -395,10 +386,10 @@
     <w:bookmarkStart w:id="13" w:name="section-1.3"/>
     <w:p>
       <w:pPr>
-        <w:pStyle w:val="Heading2"/>
-      </w:pPr>
-      <w:r>
-        <w:t xml:space="preserve">1.3 Section 1.3</w:t>
+        <w:pStyle w:val="Heading1"/>
+      </w:pPr>
+      <w:r>
+        <w:t xml:space="preserve">3. Section 1.3</w:t>
       </w:r>
     </w:p>
     <w:p>
@@ -495,7 +486,7 @@
     <w:bookmarkStart w:id="15" w:name="references"/>
     <w:p>
       <w:pPr>
-        <w:pStyle w:val="Heading2"/>
+        <w:pStyle w:val="Heading1"/>
       </w:pPr>
       <w:r>
         <w:t xml:space="preserve">References</w:t>
@@ -504,7 +495,6 @@
     <w:bookmarkStart w:id="14" w:name="refs"/>
     <w:bookmarkEnd w:id="14"/>
     <w:bookmarkEnd w:id="15"/>
-    <w:bookmarkEnd w:id="16"/>
     <w:sectPr>
       <w:footnotePr>
         <w:numRestart w:val="eachSect"/>

</xml_diff>